<commit_message>
feat: add demon soldiers to backend
</commit_message>
<xml_diff>
--- a/info/gvgStrategies.docx
+++ b/info/gvgStrategies.docx
@@ -91,7 +91,7 @@
           <w:bCs/>
         </w:rPr>
         <w:pict w14:anchorId="1A33BEF9">
-          <v:rect id="_x0000_i1073" style="width:0;height:1.5pt" o:hralign="center" o:hrstd="t" o:hr="t" fillcolor="#a0a0a0" stroked="f"/>
+          <v:rect id="_x0000_i1025" style="width:0;height:1.5pt" o:hralign="center" o:hrstd="t" o:hr="t" fillcolor="#a0a0a0" stroked="f"/>
         </w:pict>
       </w:r>
     </w:p>
@@ -327,7 +327,7 @@
           <w:bCs/>
         </w:rPr>
         <w:pict w14:anchorId="4E3213F9">
-          <v:rect id="_x0000_i1074" style="width:0;height:1.5pt" o:hralign="center" o:hrstd="t" o:hr="t" fillcolor="#a0a0a0" stroked="f"/>
+          <v:rect id="_x0000_i1026" style="width:0;height:1.5pt" o:hralign="center" o:hrstd="t" o:hr="t" fillcolor="#a0a0a0" stroked="f"/>
         </w:pict>
       </w:r>
     </w:p>
@@ -485,7 +485,7 @@
           <w:bCs/>
         </w:rPr>
         <w:pict w14:anchorId="7235162A">
-          <v:rect id="_x0000_i1075" style="width:0;height:1.5pt" o:hralign="center" o:hrstd="t" o:hr="t" fillcolor="#a0a0a0" stroked="f"/>
+          <v:rect id="_x0000_i1027" style="width:0;height:1.5pt" o:hralign="center" o:hrstd="t" o:hr="t" fillcolor="#a0a0a0" stroked="f"/>
         </w:pict>
       </w:r>
     </w:p>
@@ -680,7 +680,7 @@
           <w:bCs/>
         </w:rPr>
         <w:pict w14:anchorId="79A039DF">
-          <v:rect id="_x0000_i1076" style="width:0;height:1.5pt" o:hralign="center" o:hrstd="t" o:hr="t" fillcolor="#a0a0a0" stroked="f"/>
+          <v:rect id="_x0000_i1028" style="width:0;height:1.5pt" o:hralign="center" o:hrstd="t" o:hr="t" fillcolor="#a0a0a0" stroked="f"/>
         </w:pict>
       </w:r>
     </w:p>
@@ -910,7 +910,7 @@
           <w:bCs/>
         </w:rPr>
         <w:pict w14:anchorId="12D92084">
-          <v:rect id="_x0000_i1077" style="width:0;height:1.5pt" o:hralign="center" o:hrstd="t" o:hr="t" fillcolor="#a0a0a0" stroked="f"/>
+          <v:rect id="_x0000_i1029" style="width:0;height:1.5pt" o:hralign="center" o:hrstd="t" o:hr="t" fillcolor="#a0a0a0" stroked="f"/>
         </w:pict>
       </w:r>
     </w:p>
@@ -1146,7 +1146,7 @@
           <w:bCs/>
         </w:rPr>
         <w:pict w14:anchorId="2EC12F36">
-          <v:rect id="_x0000_i1078" style="width:0;height:1.5pt" o:hralign="center" o:hrstd="t" o:hr="t" fillcolor="#a0a0a0" stroked="f"/>
+          <v:rect id="_x0000_i1030" style="width:0;height:1.5pt" o:hralign="center" o:hrstd="t" o:hr="t" fillcolor="#a0a0a0" stroked="f"/>
         </w:pict>
       </w:r>
     </w:p>
@@ -1280,7 +1280,7 @@
           <w:bCs/>
         </w:rPr>
         <w:pict w14:anchorId="443CFA7E">
-          <v:rect id="_x0000_i1079" style="width:0;height:1.5pt" o:hralign="center" o:hrstd="t" o:hr="t" fillcolor="#a0a0a0" stroked="f"/>
+          <v:rect id="_x0000_i1031" style="width:0;height:1.5pt" o:hralign="center" o:hrstd="t" o:hr="t" fillcolor="#a0a0a0" stroked="f"/>
         </w:pict>
       </w:r>
     </w:p>
@@ -1312,7 +1312,7 @@
           <w:bCs/>
         </w:rPr>
         <w:pict w14:anchorId="72627F60">
-          <v:rect id="_x0000_i1080" style="width:0;height:1.5pt" o:hralign="center" o:hrstd="t" o:hr="t" fillcolor="#a0a0a0" stroked="f"/>
+          <v:rect id="_x0000_i1032" style="width:0;height:1.5pt" o:hralign="center" o:hrstd="t" o:hr="t" fillcolor="#a0a0a0" stroked="f"/>
         </w:pict>
       </w:r>
     </w:p>
@@ -1609,6 +1609,7 @@
         <w:rPr>
           <w:b/>
           <w:bCs/>
+          <w:noProof/>
           <w:lang w:val="uk-UA"/>
         </w:rPr>
         <w:drawing>
@@ -1693,6 +1694,9 @@
     <w:p>
       <w:pPr>
         <w:pStyle w:val="ListParagraph"/>
+        <w:rPr>
+          <w:lang w:val="uk-UA"/>
+        </w:rPr>
       </w:pPr>
       <w:r>
         <w:rPr>
@@ -1703,6 +1707,23 @@
       </w:r>
       <w:r>
         <w:t xml:space="preserve"> 2.0 (з підтримкою сезонів та типів споруд: Форт / Вежа)</w:t>
+      </w:r>
+    </w:p>
+    <w:p>
+      <w:pPr>
+        <w:pStyle w:val="ListParagraph"/>
+        <w:rPr>
+          <w:lang w:val="uk-UA"/>
+        </w:rPr>
+      </w:pPr>
+      <w:r>
+        <w:t>башня 10х7 форт 11х8</w:t>
+      </w:r>
+      <w:r>
+        <w:rPr>
+          <w:lang w:val="uk-UA"/>
+        </w:rPr>
+        <w:t xml:space="preserve"> розміри сіток (але додати можливість щоб не ломати голову вдруг крата стане 12х9)</w:t>
       </w:r>
     </w:p>
     <w:p>
@@ -1783,6 +1804,7 @@
         <w:pStyle w:val="ListParagraph"/>
       </w:pPr>
       <w:r>
+        <w:lastRenderedPageBreak/>
         <w:br/>
       </w:r>
     </w:p>
@@ -1799,7 +1821,6 @@
           <w:b/>
           <w:bCs/>
         </w:rPr>
-        <w:lastRenderedPageBreak/>
         <w:t>Форт (</w:t>
       </w:r>
       <w:r>
@@ -2395,6 +2416,7 @@
                 <w:b/>
                 <w:bCs/>
               </w:rPr>
+              <w:lastRenderedPageBreak/>
               <w:t>MAGE</w:t>
             </w:r>
             <w:r>
@@ -2488,7 +2510,6 @@
                 <w:b/>
                 <w:bCs/>
               </w:rPr>
-              <w:lastRenderedPageBreak/>
               <w:t>HEALER</w:t>
             </w:r>
             <w:r>
@@ -2913,7 +2934,6 @@
         </w:numPr>
       </w:pPr>
       <w:r>
-        <w:lastRenderedPageBreak/>
         <w:t xml:space="preserve">soldiers </w:t>
       </w:r>
       <w:r>
@@ -3237,6 +3257,7 @@
         <w:pStyle w:val="ListParagraph"/>
       </w:pPr>
       <w:r>
+        <w:lastRenderedPageBreak/>
         <w:br/>
       </w:r>
     </w:p>
@@ -3266,7 +3287,6 @@
         </w:numPr>
       </w:pPr>
       <w:r>
-        <w:lastRenderedPageBreak/>
         <w:t>map_id (BIGINT, Foreign Key ON DELETE CASCADE) — посилання на gwg_maps</w:t>
       </w:r>
     </w:p>
@@ -3927,6 +3947,7 @@
         </w:numPr>
       </w:pPr>
       <w:r>
+        <w:lastRenderedPageBreak/>
         <w:t>GET /api/v1/gwg-maps/{id} — повертає конфігурацію карти за її ID (використовується при перегляді старого пресету).</w:t>
       </w:r>
     </w:p>
@@ -3944,7 +3965,6 @@
         </w:numPr>
       </w:pPr>
       <w:r>
-        <w:lastRenderedPageBreak/>
         <w:t xml:space="preserve">POST /api/v1/admin/gwg-maps </w:t>
       </w:r>
       <w:r>
@@ -4315,7 +4335,6 @@
           <w:b/>
           <w:bCs/>
         </w:rPr>
-        <w:lastRenderedPageBreak/>
         <w:t>Код атаки ГвГ:</w:t>
       </w:r>
       <w:r>
@@ -4637,7 +4656,6 @@
         </w:numPr>
       </w:pPr>
       <w:r>
-        <w:lastRenderedPageBreak/>
         <w:t>Дозволяє завантажити новий фоновий асет карти (Форту або Вежі), задати розмірність сітки та швидкими кліками миші маркувати плитки (GROUND, PLATFORM, NONE).</w:t>
       </w:r>
     </w:p>
@@ -5041,6 +5059,9 @@
         </w:rPr>
       </w:pPr>
       <w:r>
+        <w:rPr>
+          <w:noProof/>
+        </w:rPr>
         <w:drawing>
           <wp:inline distT="0" distB="0" distL="0" distR="0" wp14:anchorId="3EF5EAB5" wp14:editId="7582472B">
             <wp:extent cx="6152515" cy="3540760"/>

</xml_diff>